<commit_message>
Kim12-2-5-Hidrokarbonlarin-Siniflandirilmasi: gorsel alanlarina Shutter onizlemeleri yerlestirildi (2.3 bicimi)
</commit_message>
<xml_diff>
--- a/Kim12-2-5-Hidrokarbonlarin-Siniflandirilmasi.docx
+++ b/Kim12-2-5-Hidrokarbonlarin-Siniflandirilmasi.docx
@@ -39,99 +39,73 @@
         <w:t xml:space="preserve">Muzlar yeşilken toplanır ve tüketileceği yere taşındıktan sonra olgunlaştırma depolarında kontrollü bir ortamda etilen gazıyla olgunlaştırılır (Görsel A). Mum yapımında kullanılan parafin, petrolün işlenmesiyle elde edilen ve oda sıcaklığında katı olan bir maddedir (Görsel B). Eskiden yünlü kumaşları güvelerden korumak için dolaplara konan naftalin ise keskin kokulu, beyaz kristallerden oluşur. Etilen bir gaz, parafin yumuşak bir katı, naftalin ise kristal yapılı bir katıdır; ancak üçünün de molekülleri yalnızca karbon ve hidrojen atomlarından oluşur (Görsel C). Peki yalnızca bu iki elementten oluşan çok sayıdaki bileşik hangi özelliklerine göre gruplandırılabilir? Bir bileşiğin hangi gruba ait olduğunu anlamak için yapısında nelere bakmak gerekir? Bu soruların cevabını bir etkinlik yaparak keşfediniz. Analiz ve Keşif Atölyesi 2.5.’te sınıflandırma yapacaksınız: Yapı formüllerini incelediğiniz hidrokarbonları gruplamak için ölçütler belirleyecek, bu ölçütlere göre hidrokarbonları ayrıştırıp gruplandıracak, oluşturduğunuz gruplara ad verecek ve verdiğiniz adları bilimsel sınıflandırmayla karşılaştıracaksınız. Her yapıyı ölçütlerinize adım adım uygulamanız analitik düşünme eğiliminizi; güvenilir kaynaklardan bilgi toplayıp doğrulamanız bilgi okuryazarlığınızı geliştirecek, araştırmacı ve sorgulayıcı tutumunuzla çalışkanlık değerinizi destekleyeceksiniz.</w:t>
       </w:r>
     </w:p>
-    <w:tbl>
-      <w:tblPr>
-        <w:tblW w:w="9000" w:type="dxa"/>
+    <w:p>
+      <w:pPr>
         <w:jc w:val="center"/>
-        <w:tblBorders>
-          <w:top w:val="single" w:sz="8" w:space="0" w:color="7F7F7F"/>
-          <w:left w:val="single" w:sz="8" w:space="0" w:color="7F7F7F"/>
-          <w:bottom w:val="single" w:sz="8" w:space="0" w:color="7F7F7F"/>
-          <w:right w:val="single" w:sz="8" w:space="0" w:color="7F7F7F"/>
-        </w:tblBorders>
-      </w:tblPr>
-      <w:tblGrid>
-        <w:gridCol w:w="9000"/>
-      </w:tblGrid>
-      <w:tr>
-        <w:tc>
-          <w:tcPr>
-            <w:tcW w:w="9000" w:type="dxa"/>
-            <w:shd w:val="clear" w:color="auto" w:fill="EDEDED"/>
-          </w:tcPr>
-          <w:p>
-            <w:pPr>
-              <w:jc w:val="both"/>
-              <w:rPr>
-                <w:rFonts w:ascii="Times New Roman" w:hAnsi="Times New Roman" w:cs="Times New Roman"/>
-                <w:lang w:val="tr-TR"/>
-              </w:rPr>
-            </w:pPr>
-            <w:r>
-              <w:rPr>
-                <w:rFonts w:ascii="Times New Roman" w:hAnsi="Times New Roman" w:cs="Times New Roman"/>
-                <w:lang w:val="tr-TR"/>
-              </w:rPr>
-              <w:t xml:space="preserve">GÖRSEL ALANI (Shutterstock)</w:t>
-            </w:r>
-          </w:p>
-          <w:p>
-            <w:pPr>
-              <w:jc w:val="both"/>
-              <w:rPr>
-                <w:rFonts w:ascii="Times New Roman" w:hAnsi="Times New Roman" w:cs="Times New Roman"/>
-                <w:lang w:val="tr-TR"/>
-              </w:rPr>
-            </w:pPr>
-            <w:r>
-              <w:rPr>
-                <w:rFonts w:ascii="Times New Roman" w:hAnsi="Times New Roman" w:cs="Times New Roman"/>
-                <w:lang w:val="tr-TR"/>
-              </w:rPr>
-              <w:t xml:space="preserve">Tarif: Bir olgunlaştırma deposunda kasalar içinde istiflenmiş, yeşilden sarıya dönmeye başlamış muz salkımları (marka/logo görünmesin).</w:t>
-            </w:r>
-          </w:p>
-          <w:p>
-            <w:pPr>
-              <w:jc w:val="both"/>
-              <w:rPr>
-                <w:rFonts w:ascii="Times New Roman" w:hAnsi="Times New Roman" w:cs="Times New Roman"/>
-                <w:lang w:val="tr-TR"/>
-              </w:rPr>
-            </w:pPr>
-            <w:r>
-              <w:rPr>
-                <w:rFonts w:ascii="Times New Roman" w:hAnsi="Times New Roman" w:cs="Times New Roman"/>
-                <w:lang w:val="tr-TR"/>
-              </w:rPr>
-              <w:t xml:space="preserve">Shutter ID: 1057193474 (fotoğraf) — Cultivated bananas in storage room</w:t>
-            </w:r>
-          </w:p>
-        </w:tc>
-      </w:tr>
-    </w:tbl>
-    <w:p>
-      <w:pPr>
-        <w:jc w:val="both"/>
-        <w:rPr>
-          <w:rFonts w:ascii="Times New Roman" w:hAnsi="Times New Roman" w:cs="Times New Roman"/>
-          <w:lang w:val="tr-TR"/>
-        </w:rPr>
-      </w:pPr>
+      </w:pPr>
+      <w:r>
+        <w:drawing>
+          <wp:inline xmlns:a="http://schemas.openxmlformats.org/drawingml/2006/main" xmlns:pic="http://schemas.openxmlformats.org/drawingml/2006/picture">
+            <wp:extent cx="3085714" cy="2520000"/>
+            <wp:docPr id="900015" name="Picture 900015"/>
+            <wp:cNvGraphicFramePr>
+              <a:graphicFrameLocks noChangeAspect="1"/>
+            </wp:cNvGraphicFramePr>
+            <a:graphic>
+              <a:graphicData uri="http://schemas.openxmlformats.org/drawingml/2006/picture">
+                <pic:pic>
+                  <pic:nvPicPr>
+                    <pic:cNvPr id="0" name="1057193474_d.jpg"/>
+                    <pic:cNvPicPr/>
+                  </pic:nvPicPr>
+                  <pic:blipFill>
+                    <a:blip r:embed="rId11"/>
+                    <a:stretch>
+                      <a:fillRect/>
+                    </a:stretch>
+                  </pic:blipFill>
+                  <pic:spPr>
+                    <a:xfrm>
+                      <a:off x="0" y="0"/>
+                      <a:ext cx="3085714" cy="2520000"/>
+                    </a:xfrm>
+                    <a:prstGeom prst="rect"/>
+                  </pic:spPr>
+                </pic:pic>
+              </a:graphicData>
+            </a:graphic>
+          </wp:inline>
+        </w:drawing>
+      </w:r>
     </w:p>
     <w:p>
       <w:pPr>
         <w:jc w:val="center"/>
-        <w:rPr>
-          <w:rFonts w:ascii="Times New Roman" w:hAnsi="Times New Roman" w:cs="Times New Roman"/>
-          <w:lang w:val="tr-TR"/>
-        </w:rPr>
       </w:pPr>
       <w:r>
         <w:rPr>
           <w:rFonts w:ascii="Times New Roman" w:hAnsi="Times New Roman" w:cs="Times New Roman"/>
           <w:b/>
           <w:bCs/>
+          <w:highlight w:val="yellow"/>
+          <w:lang w:val="tr-TR"/>
+        </w:rPr>
+        <w:t xml:space="preserve">Shutter id: 1057193474</w:t>
+      </w:r>
+    </w:p>
+    <w:p>
+      <w:pPr>
+        <w:jc w:val="center"/>
+        <w:rPr>
+          <w:rFonts w:ascii="Times New Roman" w:hAnsi="Times New Roman" w:cs="Times New Roman"/>
+          <w:lang w:val="tr-TR"/>
+        </w:rPr>
+      </w:pPr>
+      <w:r>
+        <w:rPr>
+          <w:rFonts w:ascii="Times New Roman" w:hAnsi="Times New Roman" w:cs="Times New Roman"/>
+          <w:b/>
+          <w:bCs/>
           <w:lang w:val="tr-TR"/>
         </w:rPr>
         <w:t xml:space="preserve">Görsel A:</w:t>
@@ -144,85 +118,59 @@
         <w:t xml:space="preserve"> Olgunlaştırma deposunda muzlar</w:t>
       </w:r>
     </w:p>
-    <w:tbl>
-      <w:tblPr>
-        <w:tblW w:w="9000" w:type="dxa"/>
+    <w:p>
+      <w:pPr>
         <w:jc w:val="center"/>
-        <w:tblBorders>
-          <w:top w:val="single" w:sz="8" w:space="0" w:color="7F7F7F"/>
-          <w:left w:val="single" w:sz="8" w:space="0" w:color="7F7F7F"/>
-          <w:bottom w:val="single" w:sz="8" w:space="0" w:color="7F7F7F"/>
-          <w:right w:val="single" w:sz="8" w:space="0" w:color="7F7F7F"/>
-        </w:tblBorders>
-      </w:tblPr>
-      <w:tblGrid>
-        <w:gridCol w:w="9000"/>
-      </w:tblGrid>
-      <w:tr>
-        <w:tc>
-          <w:tcPr>
-            <w:tcW w:w="9000" w:type="dxa"/>
-            <w:shd w:val="clear" w:color="auto" w:fill="EDEDED"/>
-          </w:tcPr>
-          <w:p>
-            <w:pPr>
-              <w:jc w:val="both"/>
-              <w:rPr>
-                <w:rFonts w:ascii="Times New Roman" w:hAnsi="Times New Roman" w:cs="Times New Roman"/>
-                <w:lang w:val="tr-TR"/>
-              </w:rPr>
-            </w:pPr>
-            <w:r>
-              <w:rPr>
-                <w:rFonts w:ascii="Times New Roman" w:hAnsi="Times New Roman" w:cs="Times New Roman"/>
-                <w:lang w:val="tr-TR"/>
-              </w:rPr>
-              <w:t xml:space="preserve">GÖRSEL ALANI (Shutterstock)</w:t>
-            </w:r>
-          </w:p>
-          <w:p>
-            <w:pPr>
-              <w:jc w:val="both"/>
-              <w:rPr>
-                <w:rFonts w:ascii="Times New Roman" w:hAnsi="Times New Roman" w:cs="Times New Roman"/>
-                <w:lang w:val="tr-TR"/>
-              </w:rPr>
-            </w:pPr>
-            <w:r>
-              <w:rPr>
-                <w:rFonts w:ascii="Times New Roman" w:hAnsi="Times New Roman" w:cs="Times New Roman"/>
-                <w:lang w:val="tr-TR"/>
-              </w:rPr>
-              <w:t xml:space="preserve">Tarif: Beyaz parafin mum blokları ve el yapımı mumlar; yanında eritilmiş parafin içeren bir kap (marka/logo görünmesin).</w:t>
-            </w:r>
-          </w:p>
-          <w:p>
-            <w:pPr>
-              <w:jc w:val="both"/>
-              <w:rPr>
-                <w:rFonts w:ascii="Times New Roman" w:hAnsi="Times New Roman" w:cs="Times New Roman"/>
-                <w:lang w:val="tr-TR"/>
-              </w:rPr>
-            </w:pPr>
-            <w:r>
-              <w:rPr>
-                <w:rFonts w:ascii="Times New Roman" w:hAnsi="Times New Roman" w:cs="Times New Roman"/>
-                <w:lang w:val="tr-TR"/>
-              </w:rPr>
-              <w:t xml:space="preserve">Shutter ID: 2635065337 (fotoğraf) — Different wax types for candle making</w:t>
-            </w:r>
-          </w:p>
-        </w:tc>
-      </w:tr>
-    </w:tbl>
+      </w:pPr>
+      <w:r>
+        <w:drawing>
+          <wp:inline xmlns:a="http://schemas.openxmlformats.org/drawingml/2006/main" xmlns:pic="http://schemas.openxmlformats.org/drawingml/2006/picture">
+            <wp:extent cx="3861082" cy="2520000"/>
+            <wp:docPr id="900016" name="Picture 900016"/>
+            <wp:cNvGraphicFramePr>
+              <a:graphicFrameLocks noChangeAspect="1"/>
+            </wp:cNvGraphicFramePr>
+            <a:graphic>
+              <a:graphicData uri="http://schemas.openxmlformats.org/drawingml/2006/picture">
+                <pic:pic>
+                  <pic:nvPicPr>
+                    <pic:cNvPr id="0" name="2635065337_d.jpg"/>
+                    <pic:cNvPicPr/>
+                  </pic:nvPicPr>
+                  <pic:blipFill>
+                    <a:blip r:embed="rId12"/>
+                    <a:stretch>
+                      <a:fillRect/>
+                    </a:stretch>
+                  </pic:blipFill>
+                  <pic:spPr>
+                    <a:xfrm>
+                      <a:off x="0" y="0"/>
+                      <a:ext cx="3861082" cy="2520000"/>
+                    </a:xfrm>
+                    <a:prstGeom prst="rect"/>
+                  </pic:spPr>
+                </pic:pic>
+              </a:graphicData>
+            </a:graphic>
+          </wp:inline>
+        </w:drawing>
+      </w:r>
+    </w:p>
     <w:p>
       <w:pPr>
-        <w:jc w:val="both"/>
-        <w:rPr>
-          <w:rFonts w:ascii="Times New Roman" w:hAnsi="Times New Roman" w:cs="Times New Roman"/>
-          <w:lang w:val="tr-TR"/>
-        </w:rPr>
-      </w:pPr>
+        <w:jc w:val="center"/>
+      </w:pPr>
+      <w:r>
+        <w:rPr>
+          <w:rFonts w:ascii="Times New Roman" w:hAnsi="Times New Roman" w:cs="Times New Roman"/>
+          <w:b/>
+          <w:bCs/>
+          <w:highlight w:val="yellow"/>
+          <w:lang w:val="tr-TR"/>
+        </w:rPr>
+        <w:t xml:space="preserve">Shutter id: 2635065337</w:t>
+      </w:r>
     </w:p>
     <w:p>
       <w:pPr>

</xml_diff>